<commit_message>
Refactor md-to-docx: inline dead code, extract style helper
Inline _set_run_color into _add_run. Extract _ensure_style
to deduplicate 4 identical style creation blocks. Move import re
to top. Add _normalize_nested_lists for 2-space indent support.
Fix nested list rendering with List Bullet 2 style.
</commit_message>
<xml_diff>
--- a/docs/adrs/RMASUP-1105-employee-sync-service.docx
+++ b/docs/adrs/RMASUP-1105-employee-sync-service.docx
@@ -308,7 +308,7 @@
                 <w:color w:val="1F2937"/>
                 <w:sz w:val="20"/>
               </w:rPr>
-              <w:t>• Must use Microsoft Graph API.</w:t>
+              <w:t>Must use Microsoft Graph API.</w:t>
             </w:r>
           </w:p>
           <w:p>
@@ -323,7 +323,7 @@
                 <w:color w:val="1F2937"/>
                 <w:sz w:val="20"/>
               </w:rPr>
-              <w:t>• Must run as a background process.</w:t>
+              <w:t>Must run as a background process.</w:t>
             </w:r>
           </w:p>
           <w:p>
@@ -338,7 +338,7 @@
                 <w:color w:val="1F2937"/>
                 <w:sz w:val="20"/>
               </w:rPr>
-              <w:t>• Must detect duplicate emails across companies.</w:t>
+              <w:t>Must detect duplicate emails across companies.</w:t>
             </w:r>
           </w:p>
           <w:p>
@@ -353,7 +353,7 @@
                 <w:color w:val="1F2937"/>
                 <w:sz w:val="20"/>
               </w:rPr>
-              <w:t>• Must support a test mode for development.</w:t>
+              <w:t>Must support a test mode for development.</w:t>
             </w:r>
           </w:p>
         </w:tc>
@@ -15562,7 +15562,7 @@
     <w:basedOn w:val="Normal"/>
     <w:pPr>
       <w:spacing w:after="120"/>
-      <w:ind w:left="0" w:firstLine="0"/>
+      <w:ind w:left="0"/>
     </w:pPr>
     <w:rPr>
       <w:rFonts w:ascii="Segoe UI" w:hAnsi="Segoe UI"/>

</xml_diff>